<commit_message>
feat: complete forecasting engine, retraining pipeline, db caching, and deployment setup
</commit_message>
<xml_diff>
--- a/docs/New Microsoft Word Document.docx
+++ b/docs/New Microsoft Word Document.docx
@@ -240,7 +240,7 @@
     <w:p>
       <w:r>
         <w:pict w14:anchorId="7D06BBF4">
-          <v:rect id="_x0000_i1085" style="width:0;height:1.5pt" o:hralign="center" o:hrstd="t" o:hr="t" fillcolor="#a0a0a0" stroked="f"/>
+          <v:rect id="_x0000_i1025" style="width:0;height:1.5pt" o:hralign="center" o:hrstd="t" o:hr="t" fillcolor="#a0a0a0" stroked="f"/>
         </w:pict>
       </w:r>
     </w:p>
@@ -433,7 +433,7 @@
     <w:p>
       <w:r>
         <w:pict w14:anchorId="06658504">
-          <v:rect id="_x0000_i1086" style="width:0;height:1.5pt" o:hralign="center" o:hrstd="t" o:hr="t" fillcolor="#a0a0a0" stroked="f"/>
+          <v:rect id="_x0000_i1026" style="width:0;height:1.5pt" o:hralign="center" o:hrstd="t" o:hr="t" fillcolor="#a0a0a0" stroked="f"/>
         </w:pict>
       </w:r>
     </w:p>
@@ -563,7 +563,7 @@
     <w:p>
       <w:r>
         <w:pict w14:anchorId="7FACAA37">
-          <v:rect id="_x0000_i1087" style="width:0;height:1.5pt" o:hralign="center" o:hrstd="t" o:hr="t" fillcolor="#a0a0a0" stroked="f"/>
+          <v:rect id="_x0000_i1027" style="width:0;height:1.5pt" o:hralign="center" o:hrstd="t" o:hr="t" fillcolor="#a0a0a0" stroked="f"/>
         </w:pict>
       </w:r>
     </w:p>
@@ -682,7 +682,7 @@
     <w:p>
       <w:r>
         <w:pict w14:anchorId="1E0AEFED">
-          <v:rect id="_x0000_i1088" style="width:0;height:1.5pt" o:hralign="center" o:hrstd="t" o:hr="t" fillcolor="#a0a0a0" stroked="f"/>
+          <v:rect id="_x0000_i1028" style="width:0;height:1.5pt" o:hralign="center" o:hrstd="t" o:hr="t" fillcolor="#a0a0a0" stroked="f"/>
         </w:pict>
       </w:r>
     </w:p>
@@ -927,7 +927,7 @@
     <w:p>
       <w:r>
         <w:pict w14:anchorId="24A318F6">
-          <v:rect id="_x0000_i1089" style="width:0;height:1.5pt" o:hralign="center" o:hrstd="t" o:hr="t" fillcolor="#a0a0a0" stroked="f"/>
+          <v:rect id="_x0000_i1029" style="width:0;height:1.5pt" o:hralign="center" o:hrstd="t" o:hr="t" fillcolor="#a0a0a0" stroked="f"/>
         </w:pict>
       </w:r>
     </w:p>
@@ -1011,7 +1011,7 @@
     <w:p>
       <w:r>
         <w:pict w14:anchorId="2001623F">
-          <v:rect id="_x0000_i1090" style="width:0;height:1.5pt" o:hralign="center" o:hrstd="t" o:hr="t" fillcolor="#a0a0a0" stroked="f"/>
+          <v:rect id="_x0000_i1030" style="width:0;height:1.5pt" o:hralign="center" o:hrstd="t" o:hr="t" fillcolor="#a0a0a0" stroked="f"/>
         </w:pict>
       </w:r>
     </w:p>
@@ -1178,7 +1178,7 @@
     <w:p>
       <w:r>
         <w:pict w14:anchorId="7022CC4C">
-          <v:rect id="_x0000_i1091" style="width:0;height:1.5pt" o:hralign="center" o:hrstd="t" o:hr="t" fillcolor="#a0a0a0" stroked="f"/>
+          <v:rect id="_x0000_i1031" style="width:0;height:1.5pt" o:hralign="center" o:hrstd="t" o:hr="t" fillcolor="#a0a0a0" stroked="f"/>
         </w:pict>
       </w:r>
     </w:p>
@@ -1269,7 +1269,7 @@
     <w:p>
       <w:r>
         <w:pict w14:anchorId="02046F68">
-          <v:rect id="_x0000_i1092" style="width:0;height:1.5pt" o:hralign="center" o:hrstd="t" o:hr="t" fillcolor="#a0a0a0" stroked="f"/>
+          <v:rect id="_x0000_i1032" style="width:0;height:1.5pt" o:hralign="center" o:hrstd="t" o:hr="t" fillcolor="#a0a0a0" stroked="f"/>
         </w:pict>
       </w:r>
     </w:p>
@@ -1410,7 +1410,7 @@
     <w:p>
       <w:r>
         <w:pict w14:anchorId="7F329C8E">
-          <v:rect id="_x0000_i1093" style="width:0;height:1.5pt" o:hralign="center" o:hrstd="t" o:hr="t" fillcolor="#a0a0a0" stroked="f"/>
+          <v:rect id="_x0000_i1033" style="width:0;height:1.5pt" o:hralign="center" o:hrstd="t" o:hr="t" fillcolor="#a0a0a0" stroked="f"/>
         </w:pict>
       </w:r>
     </w:p>
@@ -1617,7 +1617,7 @@
     <w:p>
       <w:r>
         <w:pict w14:anchorId="53ACE122">
-          <v:rect id="_x0000_i1094" style="width:0;height:1.5pt" o:hralign="center" o:hrstd="t" o:hr="t" fillcolor="#a0a0a0" stroked="f"/>
+          <v:rect id="_x0000_i1034" style="width:0;height:1.5pt" o:hralign="center" o:hrstd="t" o:hr="t" fillcolor="#a0a0a0" stroked="f"/>
         </w:pict>
       </w:r>
     </w:p>
@@ -1809,7 +1809,45 @@
         <w:t>, not that you need to somehow put the satellite images directly into a traditional text RAG database.</w:t>
       </w:r>
     </w:p>
-    <w:p/>
+    <w:p>
+      <w:r>
+        <w:drawing>
+          <wp:inline distT="0" distB="0" distL="0" distR="0" wp14:anchorId="57904963" wp14:editId="555C3CAC">
+            <wp:extent cx="5601185" cy="4900085"/>
+            <wp:effectExtent l="0" t="0" r="0" b="0"/>
+            <wp:docPr id="85941797" name="Picture 1"/>
+            <wp:cNvGraphicFramePr>
+              <a:graphicFrameLocks xmlns:a="http://schemas.openxmlformats.org/drawingml/2006/main" noChangeAspect="1"/>
+            </wp:cNvGraphicFramePr>
+            <a:graphic xmlns:a="http://schemas.openxmlformats.org/drawingml/2006/main">
+              <a:graphicData uri="http://schemas.openxmlformats.org/drawingml/2006/picture">
+                <pic:pic xmlns:pic="http://schemas.openxmlformats.org/drawingml/2006/picture">
+                  <pic:nvPicPr>
+                    <pic:cNvPr id="85941797" name=""/>
+                    <pic:cNvPicPr/>
+                  </pic:nvPicPr>
+                  <pic:blipFill>
+                    <a:blip r:embed="rId5"/>
+                    <a:stretch>
+                      <a:fillRect/>
+                    </a:stretch>
+                  </pic:blipFill>
+                  <pic:spPr>
+                    <a:xfrm>
+                      <a:off x="0" y="0"/>
+                      <a:ext cx="5601185" cy="4900085"/>
+                    </a:xfrm>
+                    <a:prstGeom prst="rect">
+                      <a:avLst/>
+                    </a:prstGeom>
+                  </pic:spPr>
+                </pic:pic>
+              </a:graphicData>
+            </a:graphic>
+          </wp:inline>
+        </w:drawing>
+      </w:r>
+    </w:p>
     <w:sectPr>
       <w:pgSz w:w="11906" w:h="16838"/>
       <w:pgMar w:top="1440" w:right="1440" w:bottom="1440" w:left="1440" w:header="708" w:footer="708" w:gutter="0"/>

</xml_diff>